<commit_message>
Add CoE drafts, OpenReview paste txt, optional 42504 rating-4 review
Co-authored-by: Han Wang <202300300096@mail.sdu.edu.cn>
</commit_message>
<xml_diff>
--- a/reviews/ICLR2027_42504_50972_reviews_pandoc.docx
+++ b/reviews/ICLR2027_42504_50972_reviews_pandoc.docx
@@ -524,6 +524,112 @@
       </w:r>
       <w:r>
         <w:t xml:space="preserve">.</w:t>
+      </w:r>
+      <w:r>
+        <w:br/>
+      </w:r>
+      <w:r>
+        <w:rPr>
+          <w:bCs/>
+          <w:b/>
+        </w:rPr>
+        <w:t xml:space="preserve">Plain-text paste (no markdown):</w:t>
+      </w:r>
+      <w:r>
+        <w:t xml:space="preserve"> </w:t>
+      </w:r>
+      <w:r>
+        <w:rPr>
+          <w:rStyle w:val="VerbatimChar"/>
+        </w:rPr>
+        <w:t xml:space="preserve">paste/42504_EN_paste.txt</w:t>
+      </w:r>
+      <w:r>
+        <w:t xml:space="preserve">,</w:t>
+      </w:r>
+      <w:r>
+        <w:t xml:space="preserve"> </w:t>
+      </w:r>
+      <w:r>
+        <w:rPr>
+          <w:rStyle w:val="VerbatimChar"/>
+        </w:rPr>
+        <w:t xml:space="preserve">paste/42504_ZH_paste.txt</w:t>
+      </w:r>
+      <w:r>
+        <w:t xml:space="preserve">,</w:t>
+      </w:r>
+      <w:r>
+        <w:t xml:space="preserve"> </w:t>
+      </w:r>
+      <w:r>
+        <w:rPr>
+          <w:rStyle w:val="VerbatimChar"/>
+        </w:rPr>
+        <w:t xml:space="preserve">paste/50972_*</w:t>
+      </w:r>
+      <w:r>
+        <w:t xml:space="preserve">.</w:t>
+      </w:r>
+      <w:r>
+        <w:br/>
+      </w:r>
+      <w:r>
+        <w:rPr>
+          <w:bCs/>
+          <w:b/>
+        </w:rPr>
+        <w:t xml:space="preserve">CoE form drafts:</w:t>
+      </w:r>
+      <w:r>
+        <w:t xml:space="preserve"> </w:t>
+      </w:r>
+      <w:r>
+        <w:rPr>
+          <w:rStyle w:val="VerbatimChar"/>
+        </w:rPr>
+        <w:t xml:space="preserve">ICLR2027_CoE_reports.md</w:t>
+      </w:r>
+      <w:r>
+        <w:t xml:space="preserve">.</w:t>
+      </w:r>
+      <w:r>
+        <w:br/>
+      </w:r>
+      <w:r>
+        <w:rPr>
+          <w:bCs/>
+          <w:b/>
+        </w:rPr>
+        <w:t xml:space="preserve">42504 stricter option:</w:t>
+      </w:r>
+      <w:r>
+        <w:t xml:space="preserve"> </w:t>
+      </w:r>
+      <w:r>
+        <w:rPr>
+          <w:rStyle w:val="VerbatimChar"/>
+        </w:rPr>
+        <w:t xml:space="preserve">ICLR2027_42504_review_rating4_optional.md</w:t>
+      </w:r>
+      <w:r>
+        <w:t xml:space="preserve"> </w:t>
+      </w:r>
+      <w:r>
+        <w:t xml:space="preserve">(Rating</w:t>
+      </w:r>
+      <w:r>
+        <w:t xml:space="preserve"> </w:t>
+      </w:r>
+      <w:r>
+        <w:rPr>
+          <w:bCs/>
+          <w:b/>
+        </w:rPr>
+        <w:t xml:space="preserve">4</w:t>
+      </w:r>
+      <w:r>
+        <w:t xml:space="preserve">).</w:t>
       </w:r>
     </w:p>
     <w:p>

</xml_diff>